<commit_message>
Update AquiferOpenBibleDictionary content and metadata for 2026-04-27 release including multiple languages
</commit_message>
<xml_diff>
--- a/arb/docx/020.content.docx
+++ b/arb/docx/020.content.docx
@@ -13046,6 +13046,320 @@
         <w:rPr>
           <w:lang w:val="ar_AE" w:bidi="ar_AE"/>
         </w:rPr>
+        <w:t>فراخ، أبناء، نسل</w:t>
+      </w:r>
+      <w:r>
+        <w:rPr>
+          <w:lang w:val="ar_AE" w:bidi="ar_AE"/>
+        </w:rPr>
+      </w:r>
+    </w:p>
+    <w:p>
+      <w:pPr>
+        <w:bidi/>
+      </w:pPr>
+      <w:r>
+        <w:rPr>
+          <w:lang w:val="ar_AE" w:bidi="ar_AE"/>
+        </w:rPr>
+      </w:r>
+      <w:r>
+        <w:rPr>
+          <w:lang w:val="ar_AE" w:bidi="ar_AE"/>
+        </w:rPr>
+        <w:t>مصطلح يُستخدم غالبًا في الكتاب المقدّس للدلالة على صغار الحيوانات، ولا سيّما أفراخ الطيور، لكنه يُستخدَم أيضًا في سياقٍ أوسع.</w:t>
+      </w:r>
+    </w:p>
+    <w:p>
+      <w:pPr>
+        <w:bidi/>
+      </w:pPr>
+      <w:r>
+        <w:rPr>
+          <w:lang w:val="ar_AE" w:bidi="ar_AE"/>
+        </w:rPr>
+      </w:r>
+      <w:r>
+        <w:rPr>
+          <w:lang w:val="ar_AE" w:bidi="ar_AE"/>
+        </w:rPr>
+        <w:t>ففي العهد القديم، تشير هذه الكلمة عادةً إلى جماعةٍ من الأشخاص يتّسمون بصفةٍ مشتركة. ومن الأمثلة على ذلك:</w:t>
+      </w:r>
+    </w:p>
+    <w:p>
+      <w:pPr>
+        <w:pStyle w:val="ListBullet"/>
+        <w:bidi/>
+        <w:spacing w:line="240" w:lineRule="auto"/>
+        <w:ind w:left="720"/>
+      </w:pPr>
+      <w:r>
+        <w:rPr>
+          <w:lang w:val="ar_AE" w:bidi="ar_AE"/>
+        </w:rPr>
+      </w:r>
+      <w:r>
+        <w:rPr>
+          <w:lang w:val="ar_AE" w:bidi="ar_AE"/>
+        </w:rPr>
+        <w:t>"</w:t>
+      </w:r>
+      <w:r>
+        <w:rPr>
+          <w:lang w:val="ar_AE" w:bidi="ar_AE"/>
+        </w:rPr>
+        <w:t>أُنَاسٍ خُطَاةٍ</w:t>
+      </w:r>
+      <w:r>
+        <w:rPr>
+          <w:lang w:val="ar_AE" w:bidi="ar_AE"/>
+        </w:rPr>
+        <w:t>" (</w:t>
+      </w:r>
+      <w:hyperlink r:id="rId276">
+        <w:r>
+          <w:rPr>
+            <w:lang w:val="ar_AE" w:bidi="ar_AE"/>
+          </w:rPr>
+          <w:rPr>
+            <w:color w:val="0000EE"/>
+            <w:u w:val="single"/>
+          </w:rPr>
+          <w:t>عدد 32:14</w:t>
+        </w:r>
+      </w:hyperlink>
+      <w:r>
+        <w:rPr>
+          <w:lang w:val="ar_AE" w:bidi="ar_AE"/>
+        </w:rPr>
+        <w:t>)</w:t>
+      </w:r>
+    </w:p>
+    <w:p>
+      <w:pPr>
+        <w:pStyle w:val="ListBullet"/>
+        <w:bidi/>
+        <w:spacing w:line="240" w:lineRule="auto"/>
+        <w:ind w:left="720"/>
+      </w:pPr>
+      <w:r>
+        <w:rPr>
+          <w:lang w:val="ar_AE" w:bidi="ar_AE"/>
+        </w:rPr>
+      </w:r>
+      <w:r>
+        <w:rPr>
+          <w:lang w:val="ar_AE" w:bidi="ar_AE"/>
+        </w:rPr>
+        <w:t>"</w:t>
+      </w:r>
+      <w:r>
+        <w:rPr>
+          <w:lang w:val="ar_AE" w:bidi="ar_AE"/>
+        </w:rPr>
+        <w:t>أَبْنَاءُ أُنَاسٍ بِلاَ اسْمٍ</w:t>
+      </w:r>
+      <w:r>
+        <w:rPr>
+          <w:lang w:val="ar_AE" w:bidi="ar_AE"/>
+        </w:rPr>
+        <w:t>" (أيوب 30: 8)</w:t>
+      </w:r>
+    </w:p>
+    <w:p>
+      <w:pPr>
+        <w:pStyle w:val="ListBullet"/>
+        <w:bidi/>
+        <w:spacing w:line="240" w:lineRule="auto"/>
+        <w:ind w:left="720"/>
+      </w:pPr>
+      <w:r>
+        <w:rPr>
+          <w:lang w:val="ar_AE" w:bidi="ar_AE"/>
+        </w:rPr>
+      </w:r>
+      <w:r>
+        <w:rPr>
+          <w:lang w:val="ar_AE" w:bidi="ar_AE"/>
+        </w:rPr>
+        <w:t>"</w:t>
+      </w:r>
+      <w:r>
+        <w:rPr>
+          <w:lang w:val="ar_AE" w:bidi="ar_AE"/>
+        </w:rPr>
+        <w:t>نَسْلِ فَاعِلِي الشَّرِّ</w:t>
+      </w:r>
+      <w:r>
+        <w:rPr>
+          <w:lang w:val="ar_AE" w:bidi="ar_AE"/>
+        </w:rPr>
+        <w:t>" (إشعياء 1: 4)</w:t>
+      </w:r>
+    </w:p>
+    <w:p>
+      <w:pPr>
+        <w:bidi/>
+      </w:pPr>
+      <w:r>
+        <w:rPr>
+          <w:lang w:val="ar_AE" w:bidi="ar_AE"/>
+        </w:rPr>
+      </w:r>
+      <w:r>
+        <w:rPr>
+          <w:lang w:val="ar_AE" w:bidi="ar_AE"/>
+        </w:rPr>
+        <w:t>ثمة موضع واحد تشير فيه الكلمة إلى أفراخ الطيور حقيقةً (إشعياء 34: 15)، غير أنّ هذا الموضع يستخدم مصطلحًا عبريًا مختلفًا.</w:t>
+      </w:r>
+    </w:p>
+    <w:p>
+      <w:pPr>
+        <w:bidi/>
+      </w:pPr>
+      <w:r>
+        <w:rPr>
+          <w:lang w:val="ar_AE" w:bidi="ar_AE"/>
+        </w:rPr>
+      </w:r>
+      <w:r>
+        <w:rPr>
+          <w:lang w:val="ar_AE" w:bidi="ar_AE"/>
+        </w:rPr>
+        <w:t>أمّا في العهد الجديد، فإنّ الكلمة اليونانيّة "</w:t>
+      </w:r>
+      <w:r>
+        <w:rPr>
+          <w:i/>
+          <w:lang w:val="ar_AE" w:bidi="ar_AE"/>
+        </w:rPr>
+        <w:t>gennēma</w:t>
+      </w:r>
+      <w:r>
+        <w:rPr>
+          <w:lang w:val="ar_AE" w:bidi="ar_AE"/>
+        </w:rPr>
+        <w:t>" تُرجمت باستمرار إلى أولاد في عبارة "يَا أَوْلَادَ ٱلْأَفَاعِي" (</w:t>
+      </w:r>
+      <w:hyperlink r:id="rId277">
+        <w:r>
+          <w:rPr>
+            <w:lang w:val="ar_AE" w:bidi="ar_AE"/>
+          </w:rPr>
+          <w:rPr>
+            <w:color w:val="0000EE"/>
+            <w:u w:val="single"/>
+          </w:rPr>
+          <w:t>متى 3:7</w:t>
+        </w:r>
+      </w:hyperlink>
+      <w:r>
+        <w:rPr>
+          <w:lang w:val="ar_AE" w:bidi="ar_AE"/>
+        </w:rPr>
+        <w:t xml:space="preserve">؛ </w:t>
+      </w:r>
+      <w:hyperlink r:id="rId278">
+        <w:r>
+          <w:rPr>
+            <w:lang w:val="ar_AE" w:bidi="ar_AE"/>
+          </w:rPr>
+          <w:rPr>
+            <w:color w:val="0000EE"/>
+            <w:u w:val="single"/>
+          </w:rPr>
+          <w:t>12:34</w:t>
+        </w:r>
+      </w:hyperlink>
+      <w:r>
+        <w:rPr>
+          <w:lang w:val="ar_AE" w:bidi="ar_AE"/>
+        </w:rPr>
+        <w:t xml:space="preserve">؛ </w:t>
+      </w:r>
+      <w:hyperlink r:id="rId279">
+        <w:r>
+          <w:rPr>
+            <w:lang w:val="ar_AE" w:bidi="ar_AE"/>
+          </w:rPr>
+          <w:rPr>
+            <w:color w:val="0000EE"/>
+            <w:u w:val="single"/>
+          </w:rPr>
+          <w:t>لوقا 3:7</w:t>
+        </w:r>
+      </w:hyperlink>
+      <w:r>
+        <w:rPr>
+          <w:lang w:val="ar_AE" w:bidi="ar_AE"/>
+        </w:rPr>
+        <w:t>)، حيث تعني الذرّيّة أو النسل (ولا صلة لها هنا بالطيور).</w:t>
+      </w:r>
+    </w:p>
+    <w:p>
+      <w:pPr>
+        <w:bidi/>
+      </w:pPr>
+      <w:r>
+        <w:rPr>
+          <w:lang w:val="ar_AE" w:bidi="ar_AE"/>
+        </w:rPr>
+      </w:r>
+      <w:r>
+        <w:rPr>
+          <w:i/>
+          <w:lang w:val="ar_AE" w:bidi="ar_AE"/>
+        </w:rPr>
+        <w:t>انظر</w:t>
+      </w:r>
+      <w:r>
+        <w:rPr>
+          <w:lang w:val="ar_AE" w:bidi="ar_AE"/>
+        </w:rPr>
+        <w:t xml:space="preserve"> </w:t>
+      </w:r>
+      <w:r>
+        <w:rPr>
+          <w:lang w:val="ar_AE" w:bidi="ar_AE"/>
+        </w:rPr>
+        <w:t>الطيور (الدواجن، المنزلية؛ الحجل)</w:t>
+      </w:r>
+      <w:r>
+        <w:rPr>
+          <w:lang w:val="ar_AE" w:bidi="ar_AE"/>
+        </w:rPr>
+        <w:t>.</w:t>
+      </w:r>
+      <w:r>
+        <w:rPr>
+          <w:lang w:val="ar_AE" w:bidi="ar_AE"/>
+        </w:rPr>
+      </w:r>
+      <w:r>
+        <w:rPr>
+          <w:lang w:val="ar_AE" w:bidi="ar_AE"/>
+        </w:rPr>
+      </w:r>
+    </w:p>
+    <w:p>
+      <w:pPr>
+        <w:bidi/>
+      </w:pPr>
+      <w:r>
+        <w:rPr>
+          <w:lang w:val="ar_AE" w:bidi="ar_AE"/>
+        </w:rPr>
+      </w:r>
+    </w:p>
+    <w:p>
+      <w:pPr>
+        <w:pStyle w:val="Heading2"/>
+        <w:bidi/>
+      </w:pPr>
+      <w:r>
+        <w:rPr>
+          <w:lang w:val="ar_AE" w:bidi="ar_AE"/>
+        </w:rPr>
         <w:t>فِراش/مضجع</w:t>
       </w:r>
       <w:r>
@@ -13146,7 +13460,7 @@
         </w:rPr>
         <w:t xml:space="preserve">الجبل مذكور في </w:t>
       </w:r>
-      <w:hyperlink r:id="rId276">
+      <w:hyperlink r:id="rId280">
         <w:r>
           <w:rPr>
             <w:lang w:val="ar_AE" w:bidi="ar_AE"/>
@@ -13176,7 +13490,7 @@
         </w:rPr>
         <w:t xml:space="preserve">، "بعل الاقتحامات"، حيث هزم داود الفلسطينيين. يتضح من سياق </w:t>
       </w:r>
-      <w:hyperlink r:id="rId277">
+      <w:hyperlink r:id="rId281">
         <w:r>
           <w:rPr>
             <w:lang w:val="ar_AE" w:bidi="ar_AE"/>
@@ -13271,7 +13585,7 @@
         </w:rPr>
         <w:t xml:space="preserve"> هو اسم روماني مكتوب باليونانية ومذكور مرة واحدة فقط في العهد الجديد (</w:t>
       </w:r>
-      <w:hyperlink r:id="rId278">
+      <w:hyperlink r:id="rId282">
         <w:r>
           <w:rPr>
             <w:lang w:val="ar_AE" w:bidi="ar_AE"/>
@@ -13300,166 +13614,6 @@
           <w:lang w:val="ar_AE" w:bidi="ar_AE"/>
         </w:rPr>
         <w:t xml:space="preserve"> ليكونوا معه في أَفَسس. يحتوي النص المستلم على ملاحظة تحتية تسمي هؤلاء الثلاثة "حاملي رسالة بولس إلى أهل كورنثوس".</w:t>
-      </w:r>
-      <w:r>
-        <w:rPr>
-          <w:lang w:val="ar_AE" w:bidi="ar_AE"/>
-        </w:rPr>
-      </w:r>
-      <w:r>
-        <w:rPr>
-          <w:lang w:val="ar_AE" w:bidi="ar_AE"/>
-        </w:rPr>
-      </w:r>
-    </w:p>
-    <w:p>
-      <w:pPr>
-        <w:bidi/>
-      </w:pPr>
-      <w:r>
-        <w:rPr>
-          <w:lang w:val="ar_AE" w:bidi="ar_AE"/>
-        </w:rPr>
-      </w:r>
-    </w:p>
-    <w:p>
-      <w:pPr>
-        <w:pStyle w:val="Heading2"/>
-        <w:bidi/>
-      </w:pPr>
-      <w:r>
-        <w:rPr>
-          <w:lang w:val="ar_AE" w:bidi="ar_AE"/>
-        </w:rPr>
-        <w:t>فرخ</w:t>
-      </w:r>
-      <w:r>
-        <w:rPr>
-          <w:lang w:val="ar_AE" w:bidi="ar_AE"/>
-        </w:rPr>
-      </w:r>
-    </w:p>
-    <w:p>
-      <w:pPr>
-        <w:bidi/>
-      </w:pPr>
-      <w:r>
-        <w:rPr>
-          <w:lang w:val="ar_AE" w:bidi="ar_AE"/>
-        </w:rPr>
-      </w:r>
-      <w:r>
-        <w:rPr>
-          <w:lang w:val="ar_AE" w:bidi="ar_AE"/>
-        </w:rPr>
-        <w:t>هو مصطلح يستخدم غالبًا في الكتاب المقدس للطيور الصغيرة، ولا سيما الطيور المدربة، كما يستخدم أيضًا للثعابين أو الأفاعي بصفة استعارة تشير إلى "الخطاة" (</w:t>
-      </w:r>
-      <w:hyperlink r:id="rId279">
-        <w:r>
-          <w:rPr>
-            <w:lang w:val="ar_AE" w:bidi="ar_AE"/>
-          </w:rPr>
-          <w:rPr>
-            <w:color w:val="0000EE"/>
-            <w:u w:val="single"/>
-          </w:rPr>
-          <w:t>عدد 32:14</w:t>
-        </w:r>
-      </w:hyperlink>
-      <w:r>
-        <w:rPr>
-          <w:lang w:val="ar_AE" w:bidi="ar_AE"/>
-        </w:rPr>
-        <w:t xml:space="preserve">; </w:t>
-      </w:r>
-      <w:hyperlink r:id="rId280">
-        <w:r>
-          <w:rPr>
-            <w:lang w:val="ar_AE" w:bidi="ar_AE"/>
-          </w:rPr>
-          <w:rPr>
-            <w:color w:val="0000EE"/>
-            <w:u w:val="single"/>
-          </w:rPr>
-          <w:t>متى 3:7</w:t>
-        </w:r>
-      </w:hyperlink>
-      <w:r>
-        <w:rPr>
-          <w:lang w:val="ar_AE" w:bidi="ar_AE"/>
-        </w:rPr>
-        <w:t xml:space="preserve">; </w:t>
-      </w:r>
-      <w:hyperlink r:id="rId281">
-        <w:r>
-          <w:rPr>
-            <w:lang w:val="ar_AE" w:bidi="ar_AE"/>
-          </w:rPr>
-          <w:rPr>
-            <w:color w:val="0000EE"/>
-            <w:u w:val="single"/>
-          </w:rPr>
-          <w:t>12:34</w:t>
-        </w:r>
-      </w:hyperlink>
-      <w:r>
-        <w:rPr>
-          <w:lang w:val="ar_AE" w:bidi="ar_AE"/>
-        </w:rPr>
-        <w:t xml:space="preserve">; </w:t>
-      </w:r>
-      <w:hyperlink r:id="rId282">
-        <w:r>
-          <w:rPr>
-            <w:lang w:val="ar_AE" w:bidi="ar_AE"/>
-          </w:rPr>
-          <w:rPr>
-            <w:color w:val="0000EE"/>
-            <w:u w:val="single"/>
-          </w:rPr>
-          <w:t>لوقا 3:7</w:t>
-        </w:r>
-      </w:hyperlink>
-      <w:r>
-        <w:rPr>
-          <w:lang w:val="ar_AE" w:bidi="ar_AE"/>
-        </w:rPr>
-        <w:t>).</w:t>
-      </w:r>
-    </w:p>
-    <w:p>
-      <w:pPr>
-        <w:bidi/>
-      </w:pPr>
-      <w:r>
-        <w:rPr>
-          <w:lang w:val="ar_AE" w:bidi="ar_AE"/>
-        </w:rPr>
-      </w:r>
-      <w:r>
-        <w:rPr>
-          <w:i/>
-          <w:lang w:val="ar_AE" w:bidi="ar_AE"/>
-        </w:rPr>
-        <w:t>انظر</w:t>
-      </w:r>
-      <w:r>
-        <w:rPr>
-          <w:lang w:val="ar_AE" w:bidi="ar_AE"/>
-        </w:rPr>
-        <w:t xml:space="preserve"> </w:t>
-      </w:r>
-      <w:r>
-        <w:rPr>
-          <w:lang w:val="ar_AE" w:bidi="ar_AE"/>
-        </w:rPr>
-        <w:t>الطيور (الدواجن، المنزلية؛ الحجل)</w:t>
-      </w:r>
-      <w:r>
-        <w:rPr>
-          <w:lang w:val="ar_AE" w:bidi="ar_AE"/>
-        </w:rPr>
-        <w:t>.</w:t>
       </w:r>
       <w:r>
         <w:rPr>

</xml_diff>